<commit_message>
Adição de fotos e mensagem de feliz aniversário
</commit_message>
<xml_diff>
--- a/app/storage/templates/modelo_contrato_rca.docx
+++ b/app/storage/templates/modelo_contrato_rca.docx
@@ -1314,16 +1314,13 @@
         <w:t>Cláusula 3ª.</w:t>
       </w:r>
       <w:r>
-        <w:t xml:space="preserve"> O presente contrato </w:t>
-      </w:r>
-      <w:r>
-        <w:rPr>
-          <w:highlight w:val="yellow"/>
-        </w:rPr>
-        <w:t>entra em vigor na presente data</w:t>
-      </w:r>
-      <w:r>
-        <w:t xml:space="preserve"> e vigorará pelo prazo de indeterminado, podendo ser rescindido a qualquer tempo por qualquer das partes, desde que comunicado expressamente a outra parte com antecedência de 30 (trinta) dias, ressalvadas as obrigações em curso e as remanescentes na forma da Lei nº 4.886 e as convenções aqui celebradas.</w:t>
+        <w:t xml:space="preserve"> O presente </w:t>
+      </w:r>
+      <w:r>
+        <w:t>contrato entra em vigor na presente data e vigorará pelo prazo de indeterminado, podendo ser rescindido a qualquer tempo por qualquer das partes, desde que comunicado expressamente a outra parte com antecedência de 30 (trinta) dias</w:t>
+      </w:r>
+      <w:r>
+        <w:t>, ressalvadas as obrigações em curso e as remanescentes na forma da Lei nº 4.886 e as convenções aqui celebradas.</w:t>
       </w:r>
     </w:p>
     <w:p>
@@ -3635,23 +3632,13 @@
         <w:t>2º</w:t>
       </w:r>
       <w:r>
-        <w:t xml:space="preserve">. Admite-se como </w:t>
-      </w:r>
-      <w:proofErr w:type="gramStart"/>
-      <w:r>
-        <w:t>data</w:t>
-      </w:r>
-      <w:proofErr w:type="gramEnd"/>
+        <w:t>. Admite-se como data</w:t>
+      </w:r>
       <w:r>
         <w:t xml:space="preserve"> </w:t>
       </w:r>
-      <w:proofErr w:type="spellStart"/>
-      <w:r>
-        <w:t>data</w:t>
-      </w:r>
-      <w:proofErr w:type="spellEnd"/>
-      <w:r>
-        <w:t xml:space="preserve"> da rescisão, o último dia em que ocorrer execução de atividades, em observância a “Cláusula 27”.</w:t>
+      <w:r>
+        <w:t>da rescisão, o último dia em que ocorrer execução de atividades, em observância a “Cláusula 27”.</w:t>
       </w:r>
     </w:p>
     <w:p>
@@ -4433,11 +4420,7 @@
         <w:t>REPRESENTADA</w:t>
       </w:r>
       <w:r>
-        <w:t xml:space="preserve"> que, eventualmente, venha a ser efetuada pela </w:t>
-      </w:r>
-      <w:proofErr w:type="gramStart"/>
-      <w:r>
-        <w:t xml:space="preserve">empresa </w:t>
+        <w:t> que, eventualmente, venha a ser efetuada pela empresa</w:t>
       </w:r>
       <w:r>
         <w:rPr>
@@ -4446,7 +4429,6 @@
         </w:rPr>
         <w:t> REPRESENTANTE</w:t>
       </w:r>
-      <w:proofErr w:type="gramEnd"/>
       <w:r>
         <w:t>, será considerada sem exclusividade e por mera liberalidade daquela, não assegurando a esta, em hipótese alguma, qualquer direito, seja a que título for.</w:t>
       </w:r>
@@ -4473,11 +4455,7 @@
         <w:t>Cláusula 38ª. </w:t>
       </w:r>
       <w:r>
-        <w:t>A </w:t>
-      </w:r>
-      <w:proofErr w:type="gramStart"/>
-      <w:r>
-        <w:t xml:space="preserve">empresa </w:t>
+        <w:t>A empresa</w:t>
       </w:r>
       <w:r>
         <w:rPr>
@@ -4486,7 +4464,6 @@
         </w:rPr>
         <w:t> REPRESENTANTE</w:t>
       </w:r>
-      <w:proofErr w:type="gramEnd"/>
       <w:r>
         <w:t> não poderá utilizar, jamais, como parte integrante de sua denominação social, ou de terceiros a ela ligados, qualquer das marcas, sinais ou expressões de propaganda e nem qualquer outro que possa induzir o público a julgar que integre os quadros da </w:t>
       </w:r>
@@ -4928,7 +4905,13 @@
       </w:r>
       <w:proofErr w:type="spellStart"/>
       <w:r>
-        <w:t>boa fé</w:t>
+        <w:t>boa</w:t>
+      </w:r>
+      <w:r>
+        <w:t xml:space="preserve"> </w:t>
+      </w:r>
+      <w:r>
+        <w:t>fé</w:t>
       </w:r>
       <w:proofErr w:type="spellEnd"/>
       <w:r>
@@ -5083,15 +5066,7 @@
         <w:jc w:val="both"/>
       </w:pPr>
       <w:r>
-        <w:t xml:space="preserve">As Partes e as testemunhas envolvidas neste instrumento afirmam e declaram que esse poderá ser assinado eletronicamente através da plataforma </w:t>
-      </w:r>
-      <w:proofErr w:type="spellStart"/>
-      <w:r>
-        <w:t>Clicksign</w:t>
-      </w:r>
-      <w:proofErr w:type="spellEnd"/>
-      <w:r>
-        <w:t>, atualmente no endereço </w:t>
+        <w:t>As Partes e as testemunhas envolvidas neste instrumento afirmam e declaram que esse poderá ser assinado eletronicamente através da plataforma Clicksign, atualmente no endereço </w:t>
       </w:r>
       <w:hyperlink r:id="rId8">
         <w:r>
@@ -5195,7 +5170,21 @@
           <w:b/>
           <w:bCs/>
         </w:rPr>
-        <w:t xml:space="preserve">       BELMAX S/A                             </w:t>
+        <w:t xml:space="preserve">       BELMAX S/A     </w:t>
+      </w:r>
+      <w:r>
+        <w:rPr>
+          <w:b/>
+          <w:bCs/>
+        </w:rPr>
+        <w:t xml:space="preserve">             </w:t>
+      </w:r>
+      <w:r>
+        <w:rPr>
+          <w:b/>
+          <w:bCs/>
+        </w:rPr>
+        <w:t xml:space="preserve">                        </w:t>
       </w:r>
       <w:r>
         <w:rPr>
@@ -5306,6 +5295,21 @@
           <w:pgMar w:top="624" w:right="1020" w:bottom="738" w:left="1020" w:header="720" w:footer="607" w:gutter="0"/>
           <w:cols w:space="720"/>
         </w:sectPr>
+      </w:pPr>
+    </w:p>
+    <w:p>
+      <w:pPr>
+        <w:spacing w:after="0" w:line="240" w:lineRule="auto"/>
+        <w:jc w:val="both"/>
+      </w:pPr>
+      <w:r>
+        <w:t>Testemunhas:</w:t>
+      </w:r>
+    </w:p>
+    <w:p>
+      <w:pPr>
+        <w:spacing w:after="0" w:line="240" w:lineRule="auto"/>
+        <w:jc w:val="both"/>
       </w:pPr>
     </w:p>
     <w:p>
@@ -5322,9 +5326,6 @@
           </w:cols>
         </w:sectPr>
       </w:pPr>
-      <w:r>
-        <w:t>Testemunhas:</w:t>
-      </w:r>
     </w:p>
     <w:p>
       <w:pPr>
@@ -5382,11 +5383,10 @@
         <w:tab/>
       </w:r>
       <w:r>
-        <w:tab/>
-      </w:r>
-      <w:r>
-        <w:tab/>
-        <w:t>GABRIELLI PEREIRA DE SOUZA</w:t>
+        <w:t xml:space="preserve">                  </w:t>
+      </w:r>
+      <w:r>
+        <w:t>THAYNARA DO SACRAMENTO LUMGUINHO</w:t>
       </w:r>
       <w:r>
         <w:br/>
@@ -5402,14 +5402,151 @@
         <w:tab/>
       </w:r>
       <w:r>
-        <w:tab/>
-        <w:t>169.408.137-05</w:t>
-      </w:r>
-    </w:p>
-    <w:p>
-      <w:pPr>
-        <w:spacing w:after="0" w:line="240" w:lineRule="auto"/>
-        <w:jc w:val="both"/>
+        <w:t xml:space="preserve">    </w:t>
+      </w:r>
+      <w:r>
+        <w:t>131</w:t>
+      </w:r>
+      <w:r>
+        <w:t>.</w:t>
+      </w:r>
+      <w:r>
+        <w:t>261</w:t>
+      </w:r>
+      <w:r>
+        <w:t>.</w:t>
+      </w:r>
+      <w:r>
+        <w:t>077</w:t>
+      </w:r>
+      <w:r>
+        <w:t>-</w:t>
+      </w:r>
+      <w:r>
+        <w:t>88</w:t>
+      </w:r>
+    </w:p>
+    <w:p>
+      <w:pPr>
+        <w:spacing w:after="0" w:line="240" w:lineRule="auto"/>
+        <w:jc w:val="both"/>
+      </w:pPr>
+    </w:p>
+    <w:p>
+      <w:pPr>
+        <w:spacing w:after="0" w:line="240" w:lineRule="auto"/>
+        <w:jc w:val="both"/>
+        <w:rPr>
+          <w:u w:val="single"/>
+        </w:rPr>
+      </w:pPr>
+    </w:p>
+    <w:p>
+      <w:pPr>
+        <w:spacing w:after="0" w:line="240" w:lineRule="auto"/>
+        <w:jc w:val="both"/>
+        <w:rPr>
+          <w:u w:val="single"/>
+        </w:rPr>
+      </w:pPr>
+    </w:p>
+    <w:p>
+      <w:pPr>
+        <w:spacing w:after="0" w:line="240" w:lineRule="auto"/>
+        <w:jc w:val="both"/>
+        <w:rPr>
+          <w:u w:val="single"/>
+        </w:rPr>
+      </w:pPr>
+    </w:p>
+    <w:p>
+      <w:pPr>
+        <w:spacing w:after="0" w:line="240" w:lineRule="auto"/>
+        <w:jc w:val="both"/>
+        <w:rPr>
+          <w:u w:val="single"/>
+        </w:rPr>
+      </w:pPr>
+    </w:p>
+    <w:p>
+      <w:pPr>
+        <w:spacing w:after="0" w:line="240" w:lineRule="auto"/>
+        <w:jc w:val="both"/>
+        <w:rPr>
+          <w:u w:val="single"/>
+        </w:rPr>
+      </w:pPr>
+    </w:p>
+    <w:p>
+      <w:pPr>
+        <w:spacing w:after="0" w:line="240" w:lineRule="auto"/>
+        <w:jc w:val="both"/>
+        <w:rPr>
+          <w:u w:val="single"/>
+        </w:rPr>
+      </w:pPr>
+    </w:p>
+    <w:p>
+      <w:pPr>
+        <w:spacing w:after="0" w:line="240" w:lineRule="auto"/>
+        <w:jc w:val="both"/>
+        <w:rPr>
+          <w:u w:val="single"/>
+        </w:rPr>
+      </w:pPr>
+    </w:p>
+    <w:p>
+      <w:pPr>
+        <w:spacing w:after="0" w:line="240" w:lineRule="auto"/>
+        <w:jc w:val="both"/>
+        <w:rPr>
+          <w:u w:val="single"/>
+        </w:rPr>
+      </w:pPr>
+    </w:p>
+    <w:p>
+      <w:pPr>
+        <w:spacing w:after="0" w:line="240" w:lineRule="auto"/>
+        <w:jc w:val="both"/>
+        <w:rPr>
+          <w:u w:val="single"/>
+        </w:rPr>
+      </w:pPr>
+    </w:p>
+    <w:p>
+      <w:pPr>
+        <w:spacing w:after="0" w:line="240" w:lineRule="auto"/>
+        <w:jc w:val="both"/>
+        <w:rPr>
+          <w:u w:val="single"/>
+        </w:rPr>
+      </w:pPr>
+    </w:p>
+    <w:p>
+      <w:pPr>
+        <w:spacing w:after="0" w:line="240" w:lineRule="auto"/>
+        <w:jc w:val="both"/>
+        <w:rPr>
+          <w:u w:val="single"/>
+        </w:rPr>
+      </w:pPr>
+    </w:p>
+    <w:p>
+      <w:pPr>
+        <w:spacing w:after="0" w:line="240" w:lineRule="auto"/>
+        <w:jc w:val="both"/>
+        <w:rPr>
+          <w:u w:val="single"/>
+        </w:rPr>
+      </w:pPr>
+    </w:p>
+    <w:p>
+      <w:pPr>
+        <w:spacing w:after="0" w:line="240" w:lineRule="auto"/>
+        <w:jc w:val="both"/>
+        <w:rPr>
+          <w:u w:val="single"/>
+        </w:rPr>
       </w:pPr>
     </w:p>
     <w:p>
@@ -5558,11 +5695,7 @@
         <w:t xml:space="preserve"> REPRESENTANTE</w:t>
       </w:r>
       <w:r>
-        <w:t xml:space="preserve">, sem que isso </w:t>
-      </w:r>
-      <w:r>
-        <w:lastRenderedPageBreak/>
-        <w:t>implique em rescisão contratual, reparação, compensação ou indenização em relação à EMPRESA</w:t>
+        <w:t>, sem que isso implique em rescisão contratual, reparação, compensação ou indenização em relação à EMPRESA</w:t>
       </w:r>
       <w:r>
         <w:rPr>
@@ -5644,6 +5777,24 @@
       <w:r>
         <w:t>Viana, ES, [data da assinatura]</w:t>
       </w:r>
+    </w:p>
+    <w:p>
+      <w:pPr>
+        <w:spacing w:after="0" w:line="240" w:lineRule="auto"/>
+        <w:jc w:val="both"/>
+      </w:pPr>
+    </w:p>
+    <w:p>
+      <w:pPr>
+        <w:spacing w:after="0" w:line="240" w:lineRule="auto"/>
+        <w:jc w:val="both"/>
+      </w:pPr>
+    </w:p>
+    <w:p>
+      <w:pPr>
+        <w:spacing w:after="0" w:line="240" w:lineRule="auto"/>
+        <w:jc w:val="both"/>
+      </w:pPr>
     </w:p>
     <w:p>
       <w:pPr>
@@ -5771,6 +5922,39 @@
         </w:rPr>
         <w:t xml:space="preserve"> </w:t>
       </w:r>
+    </w:p>
+    <w:p>
+      <w:pPr>
+        <w:spacing w:after="0" w:line="240" w:lineRule="auto"/>
+        <w:jc w:val="both"/>
+      </w:pPr>
+      <w:r>
+        <w:t>Testemunhas:</w:t>
+      </w:r>
+    </w:p>
+    <w:p>
+      <w:pPr>
+        <w:spacing w:after="0" w:line="240" w:lineRule="auto"/>
+        <w:jc w:val="both"/>
+      </w:pPr>
+    </w:p>
+    <w:p>
+      <w:pPr>
+        <w:spacing w:after="0" w:line="240" w:lineRule="auto"/>
+        <w:jc w:val="both"/>
+      </w:pPr>
+    </w:p>
+    <w:p>
+      <w:pPr>
+        <w:spacing w:after="0" w:line="240" w:lineRule="auto"/>
+        <w:jc w:val="both"/>
+      </w:pPr>
+    </w:p>
+    <w:p>
+      <w:pPr>
+        <w:spacing w:after="0" w:line="240" w:lineRule="auto"/>
+        <w:jc w:val="both"/>
+      </w:pPr>
     </w:p>
     <w:p>
       <w:pPr>
@@ -5786,9 +5970,6 @@
           </w:cols>
         </w:sectPr>
       </w:pPr>
-      <w:r>
-        <w:t>Testemunhas:</w:t>
-      </w:r>
     </w:p>
     <w:p>
       <w:pPr>
@@ -5798,12 +5979,6 @@
       <w:r>
         <w:t xml:space="preserve">_________________________________ </w:t>
       </w:r>
-    </w:p>
-    <w:p>
-      <w:pPr>
-        <w:spacing w:after="0" w:line="240" w:lineRule="auto"/>
-        <w:jc w:val="both"/>
-      </w:pPr>
     </w:p>
     <w:p>
       <w:pPr>
@@ -5844,13 +6019,10 @@
       </w:r>
       <w:r>
         <w:tab/>
-      </w:r>
-      <w:r>
-        <w:tab/>
-      </w:r>
-      <w:r>
-        <w:tab/>
-        <w:t>GABRIELLI PEREIRA DE SOUZA</w:t>
+        <w:t xml:space="preserve">                  </w:t>
+      </w:r>
+      <w:r>
+        <w:t>THAYNARA DO SACRAMENTO LUMGUINHO</w:t>
       </w:r>
       <w:r>
         <w:br/>
@@ -5864,10 +6036,28 @@
       </w:r>
       <w:r>
         <w:tab/>
-      </w:r>
-      <w:r>
-        <w:tab/>
-        <w:t>169.408.137-05</w:t>
+        <w:t xml:space="preserve">    </w:t>
+      </w:r>
+      <w:r>
+        <w:t>131</w:t>
+      </w:r>
+      <w:r>
+        <w:t>.</w:t>
+      </w:r>
+      <w:r>
+        <w:t>261</w:t>
+      </w:r>
+      <w:r>
+        <w:t>.</w:t>
+      </w:r>
+      <w:r>
+        <w:t>077</w:t>
+      </w:r>
+      <w:r>
+        <w:t>-</w:t>
+      </w:r>
+      <w:r>
+        <w:t>88</w:t>
       </w:r>
     </w:p>
     <w:p>
@@ -6031,44 +6221,42 @@
         <w:rPr>
           <w:b/>
           <w:bCs/>
+        </w:rPr>
+      </w:pPr>
+      <w:r>
+        <w:rPr>
+          <w:b/>
+          <w:bCs/>
           <w:highlight w:val="white"/>
         </w:rPr>
-      </w:pPr>
-    </w:p>
-    <w:p>
-      <w:pPr>
-        <w:spacing w:after="0" w:line="240" w:lineRule="auto"/>
-        <w:jc w:val="both"/>
-        <w:rPr>
-          <w:b/>
-          <w:bCs/>
+        <w:t xml:space="preserve">ANEXO II - </w:t>
+      </w:r>
+      <w:r>
+        <w:rPr>
+          <w:b/>
+          <w:bCs/>
+        </w:rPr>
+        <w:t xml:space="preserve">DA COMISSÃO E DAS CONDIÇÕES DE PAGAMENTO </w:t>
+      </w:r>
+    </w:p>
+    <w:p>
+      <w:pPr>
+        <w:spacing w:after="0" w:line="240" w:lineRule="auto"/>
+        <w:jc w:val="both"/>
+        <w:rPr>
+          <w:b/>
+          <w:bCs/>
+        </w:rPr>
+      </w:pPr>
+    </w:p>
+    <w:p>
+      <w:pPr>
+        <w:spacing w:after="0" w:line="240" w:lineRule="auto"/>
+        <w:jc w:val="both"/>
+        <w:rPr>
           <w:highlight w:val="white"/>
         </w:rPr>
       </w:pPr>
-    </w:p>
-    <w:p>
-      <w:pPr>
-        <w:spacing w:after="0" w:line="240" w:lineRule="auto"/>
-        <w:jc w:val="both"/>
-        <w:rPr>
-          <w:highlight w:val="white"/>
-        </w:rPr>
-      </w:pPr>
-      <w:r>
-        <w:rPr>
-          <w:b/>
-          <w:bCs/>
-          <w:highlight w:val="white"/>
-        </w:rPr>
-        <w:t xml:space="preserve">ANEXO II - </w:t>
-      </w:r>
-      <w:r>
-        <w:rPr>
-          <w:b/>
-          <w:bCs/>
-        </w:rPr>
-        <w:t xml:space="preserve">DA COMISSÃO E DAS CONDIÇÕES DE PAGAMENTO </w:t>
-      </w:r>
     </w:p>
     <w:p>
       <w:pPr>
@@ -6657,15 +6845,7 @@
         <w:jc w:val="both"/>
       </w:pPr>
       <w:r>
-        <w:t xml:space="preserve">As Partes e as testemunhas envolvidas neste instrumento afirmam e declaram que esse poderá ser assinado eletronicamente através da plataforma </w:t>
-      </w:r>
-      <w:proofErr w:type="spellStart"/>
-      <w:r>
-        <w:t>Clicksign</w:t>
-      </w:r>
-      <w:proofErr w:type="spellEnd"/>
-      <w:r>
-        <w:t xml:space="preserve">, atualmente no endereço </w:t>
+        <w:t xml:space="preserve">As Partes e as testemunhas envolvidas neste instrumento afirmam e declaram que esse poderá ser assinado eletronicamente através da plataforma Clicksign, atualmente no endereço </w:t>
       </w:r>
       <w:hyperlink r:id="rId11">
         <w:r>
@@ -6676,7 +6856,11 @@
         </w:r>
       </w:hyperlink>
       <w:r>
-        <w:t xml:space="preserve"> com fundamento no Artigo 10, parágrafo 2º da MP 2200-2/2001, e do Artigo 6º do Decreto 10.278/2020, sendo as assinaturas consideradas válidas, vinculantes e executáveis, desde que firmadas pelos representantes legais das Partes. Consigna-se no presente instrumento que a assinatura com Certificado Digital/eletrônica tem a mesma validade jurídica de um registro e autenticação feita em cartório, seja mediante utilização de certificados e-CPF, e-CNPJ e/ou NF-e. As Partes renunciam à possibilidade de exigir a troca, envio ou entrega das vias originais (não-eletrônicas) assinadas do instrumento, bem como renunciam ao direito de recusar ou contestar a validade das assinaturas eletrônicas, na medida máxima permitida pela legislação aplicável.</w:t>
+        <w:t xml:space="preserve"> com fundamento no Artigo 10, parágrafo 2º da MP 2200-2/2001, e do Artigo 6º do Decreto 10.278/2020, sendo as assinaturas consideradas válidas, vinculantes e executáveis, desde que firmadas pelos representantes legais das </w:t>
+      </w:r>
+      <w:r>
+        <w:lastRenderedPageBreak/>
+        <w:t>Partes. Consigna-se no presente instrumento que a assinatura com Certificado Digital/eletrônica tem a mesma validade jurídica de um registro e autenticação feita em cartório, seja mediante utilização de certificados e-CPF, e-CNPJ e/ou NF-e. As Partes renunciam à possibilidade de exigir a troca, envio ou entrega das vias originais (não-eletrônicas) assinadas do instrumento, bem como renunciam ao direito de recusar ou contestar a validade das assinaturas eletrônicas, na medida máxima permitida pela legislação aplicável.</w:t>
       </w:r>
     </w:p>
     <w:p>
@@ -6811,6 +6995,27 @@
       <w:pPr>
         <w:spacing w:after="0" w:line="240" w:lineRule="auto"/>
         <w:jc w:val="both"/>
+      </w:pPr>
+      <w:r>
+        <w:t xml:space="preserve">  </w:t>
+      </w:r>
+    </w:p>
+    <w:p>
+      <w:pPr>
+        <w:spacing w:after="0" w:line="240" w:lineRule="auto"/>
+        <w:jc w:val="both"/>
+      </w:pPr>
+    </w:p>
+    <w:p>
+      <w:pPr>
+        <w:spacing w:after="0" w:line="240" w:lineRule="auto"/>
+        <w:jc w:val="both"/>
+      </w:pPr>
+    </w:p>
+    <w:p>
+      <w:pPr>
+        <w:spacing w:after="0" w:line="240" w:lineRule="auto"/>
+        <w:jc w:val="both"/>
         <w:sectPr>
           <w:type w:val="continuous"/>
           <w:pgSz w:w="11906" w:h="16838"/>
@@ -6819,7 +7024,7 @@
         </w:sectPr>
       </w:pPr>
       <w:r>
-        <w:t xml:space="preserve">                         </w:t>
+        <w:t xml:space="preserve">                       </w:t>
       </w:r>
     </w:p>
     <w:p>
@@ -6894,10 +7099,6 @@
     <w:p>
       <w:pPr>
         <w:spacing w:after="0" w:line="240" w:lineRule="auto"/>
-        <w:rPr>
-          <w:i/>
-          <w:iCs/>
-        </w:rPr>
         <w:sectPr>
           <w:type w:val="continuous"/>
           <w:pgSz w:w="11906" w:h="16838"/>
@@ -6906,7 +7107,7 @@
         </w:sectPr>
       </w:pPr>
       <w:r>
-        <w:t xml:space="preserve">IDAIANE GHISOLFI GUIMARAES </w:t>
+        <w:t>IDAIANE GHISOLFI GUIMARÃES</w:t>
       </w:r>
       <w:r>
         <w:tab/>
@@ -6916,10 +7117,10 @@
       </w:r>
       <w:r>
         <w:tab/>
-      </w:r>
-      <w:r>
-        <w:tab/>
-        <w:t xml:space="preserve">    GABRIELLI PEREIRA DE SOUZA</w:t>
+        <w:t xml:space="preserve">                  </w:t>
+      </w:r>
+      <w:r>
+        <w:t>THAYNARA DO SACRAMENTO LUMGUINHO</w:t>
       </w:r>
       <w:r>
         <w:br/>
@@ -6933,35 +7134,29 @@
       </w:r>
       <w:r>
         <w:tab/>
-        <w:t xml:space="preserve">    169.408.137-05</w:t>
-      </w:r>
-    </w:p>
-    <w:p>
-      <w:pPr>
-        <w:spacing w:after="0" w:line="240" w:lineRule="auto"/>
-        <w:jc w:val="both"/>
-        <w:sectPr>
-          <w:type w:val="continuous"/>
-          <w:pgSz w:w="11906" w:h="16838"/>
-          <w:pgMar w:top="1440" w:right="1080" w:bottom="1440" w:left="1080" w:header="720" w:footer="720" w:gutter="0"/>
-          <w:cols w:num="2" w:space="720" w:equalWidth="0">
-            <w:col w:w="4513" w:space="720"/>
-            <w:col w:w="4513" w:space="0"/>
-          </w:cols>
-        </w:sectPr>
-      </w:pPr>
-    </w:p>
-    <w:p>
-      <w:pPr>
-        <w:spacing w:after="240" w:line="240" w:lineRule="auto"/>
-        <w:jc w:val="both"/>
-      </w:pPr>
-    </w:p>
-    <w:p>
-      <w:pPr>
-        <w:spacing w:after="240" w:line="240" w:lineRule="auto"/>
-        <w:jc w:val="both"/>
-      </w:pPr>
+        <w:t xml:space="preserve">    </w:t>
+      </w:r>
+      <w:r>
+        <w:t>131</w:t>
+      </w:r>
+      <w:r>
+        <w:t>.</w:t>
+      </w:r>
+      <w:r>
+        <w:t>261</w:t>
+      </w:r>
+      <w:r>
+        <w:t>.</w:t>
+      </w:r>
+      <w:r>
+        <w:t>077</w:t>
+      </w:r>
+      <w:r>
+        <w:t>-</w:t>
+      </w:r>
+      <w:r>
+        <w:t>88</w:t>
+      </w:r>
     </w:p>
     <w:p>
       <w:pPr>
@@ -7073,43 +7268,30 @@
           <w:bCs/>
         </w:rPr>
       </w:pPr>
-      <w:r>
-        <w:rPr>
-          <w:b/>
-          <w:bCs/>
-        </w:rPr>
-        <w:t>ANEXO III - CONTRATO DE AGÊNCIA OU REPRESENTAÇÃO COMERCIAL ENTRE BELMAX S/A E SHALOM REPRESENTACOES COMERCIAIS LTDA</w:t>
-      </w:r>
-    </w:p>
-    <w:p>
-      <w:pPr>
-        <w:spacing w:after="0" w:line="240" w:lineRule="auto"/>
-        <w:jc w:val="both"/>
-        <w:rPr>
-          <w:b/>
-          <w:bCs/>
-        </w:rPr>
-      </w:pPr>
-    </w:p>
-    <w:p>
-      <w:pPr>
-        <w:spacing w:after="0" w:line="240" w:lineRule="auto"/>
-        <w:jc w:val="both"/>
-        <w:rPr>
-          <w:b/>
-          <w:bCs/>
-        </w:rPr>
-      </w:pPr>
-    </w:p>
-    <w:p>
-      <w:pPr>
-        <w:spacing w:after="0" w:line="240" w:lineRule="auto"/>
-        <w:jc w:val="center"/>
-        <w:rPr>
-          <w:b/>
-          <w:bCs/>
-        </w:rPr>
-      </w:pPr>
+    </w:p>
+    <w:p>
+      <w:pPr>
+        <w:spacing w:after="0" w:line="240" w:lineRule="auto"/>
+        <w:rPr>
+          <w:b/>
+          <w:bCs/>
+        </w:rPr>
+      </w:pPr>
+      <w:r>
+        <w:rPr>
+          <w:b/>
+          <w:bCs/>
+        </w:rPr>
+        <w:lastRenderedPageBreak/>
+        <w:t xml:space="preserve">ANEXO III </w:t>
+      </w:r>
+      <w:r>
+        <w:rPr>
+          <w:b/>
+          <w:bCs/>
+        </w:rPr>
+        <w:t xml:space="preserve">- </w:t>
+      </w:r>
       <w:r>
         <w:rPr>
           <w:b/>
@@ -7434,10 +7616,6 @@
     <w:p>
       <w:pPr>
         <w:spacing w:after="0" w:line="240" w:lineRule="auto"/>
-        <w:rPr>
-          <w:i/>
-          <w:iCs/>
-        </w:rPr>
         <w:sectPr>
           <w:type w:val="continuous"/>
           <w:pgSz w:w="11906" w:h="16838"/>
@@ -7446,18 +7624,24 @@
         </w:sectPr>
       </w:pPr>
       <w:r>
-        <w:t xml:space="preserve">IDAIANE GHISOLFI GUIMARAES                          </w:t>
+        <w:t>IDAIANE GHISOLFI GUIMARÃES</w:t>
       </w:r>
       <w:r>
         <w:tab/>
       </w:r>
       <w:r>
         <w:tab/>
-        <w:t>GABRIELLI PEREIRA DE SOUZA</w:t>
+      </w:r>
+      <w:r>
+        <w:tab/>
+        <w:t xml:space="preserve">                  </w:t>
+      </w:r>
+      <w:r>
+        <w:t>THAYNARA DO SACRAMENTO LUMGUINHO</w:t>
       </w:r>
       <w:r>
         <w:br/>
-        <w:t xml:space="preserve"> 098.075.577-80                                       </w:t>
+        <w:t xml:space="preserve">098.075.577-80                                       </w:t>
       </w:r>
       <w:r>
         <w:tab/>
@@ -7467,23 +7651,29 @@
       </w:r>
       <w:r>
         <w:tab/>
-        <w:t>169.408.137-05</w:t>
-      </w:r>
-    </w:p>
-    <w:p>
-      <w:pPr>
-        <w:spacing w:after="0" w:line="240" w:lineRule="auto"/>
-        <w:jc w:val="both"/>
-        <w:sectPr>
-          <w:type w:val="continuous"/>
-          <w:pgSz w:w="11906" w:h="16838"/>
-          <w:pgMar w:top="1440" w:right="1080" w:bottom="1440" w:left="1080" w:header="720" w:footer="720" w:gutter="0"/>
-          <w:cols w:num="2" w:space="720" w:equalWidth="0">
-            <w:col w:w="4513" w:space="720"/>
-            <w:col w:w="4513" w:space="0"/>
-          </w:cols>
-        </w:sectPr>
-      </w:pPr>
+        <w:t xml:space="preserve">    </w:t>
+      </w:r>
+      <w:r>
+        <w:t>131</w:t>
+      </w:r>
+      <w:r>
+        <w:t>.</w:t>
+      </w:r>
+      <w:r>
+        <w:t>261</w:t>
+      </w:r>
+      <w:r>
+        <w:t>.</w:t>
+      </w:r>
+      <w:r>
+        <w:t>077</w:t>
+      </w:r>
+      <w:r>
+        <w:t>-</w:t>
+      </w:r>
+      <w:r>
+        <w:t>88</w:t>
+      </w:r>
     </w:p>
     <w:p>
       <w:pPr>
@@ -7495,6 +7685,96 @@
           <w:pgMar w:top="1276" w:right="1080" w:bottom="1440" w:left="1080" w:header="142" w:footer="720" w:gutter="0"/>
           <w:cols w:space="720"/>
         </w:sectPr>
+      </w:pPr>
+    </w:p>
+    <w:p>
+      <w:pPr>
+        <w:spacing w:after="0" w:line="240" w:lineRule="auto"/>
+        <w:jc w:val="both"/>
+        <w:rPr>
+          <w:b/>
+          <w:bCs/>
+        </w:rPr>
+      </w:pPr>
+    </w:p>
+    <w:p>
+      <w:pPr>
+        <w:spacing w:after="0" w:line="240" w:lineRule="auto"/>
+        <w:jc w:val="both"/>
+        <w:rPr>
+          <w:b/>
+          <w:bCs/>
+        </w:rPr>
+      </w:pPr>
+    </w:p>
+    <w:p>
+      <w:pPr>
+        <w:spacing w:after="0" w:line="240" w:lineRule="auto"/>
+        <w:jc w:val="both"/>
+        <w:rPr>
+          <w:b/>
+          <w:bCs/>
+        </w:rPr>
+      </w:pPr>
+    </w:p>
+    <w:p>
+      <w:pPr>
+        <w:spacing w:after="0" w:line="240" w:lineRule="auto"/>
+        <w:jc w:val="both"/>
+        <w:rPr>
+          <w:b/>
+          <w:bCs/>
+        </w:rPr>
+      </w:pPr>
+    </w:p>
+    <w:p>
+      <w:pPr>
+        <w:spacing w:after="0" w:line="240" w:lineRule="auto"/>
+        <w:jc w:val="both"/>
+        <w:rPr>
+          <w:b/>
+          <w:bCs/>
+        </w:rPr>
+      </w:pPr>
+    </w:p>
+    <w:p>
+      <w:pPr>
+        <w:spacing w:after="0" w:line="240" w:lineRule="auto"/>
+        <w:jc w:val="both"/>
+        <w:rPr>
+          <w:b/>
+          <w:bCs/>
+        </w:rPr>
+      </w:pPr>
+    </w:p>
+    <w:p>
+      <w:pPr>
+        <w:spacing w:after="0" w:line="240" w:lineRule="auto"/>
+        <w:jc w:val="both"/>
+        <w:rPr>
+          <w:b/>
+          <w:bCs/>
+        </w:rPr>
+      </w:pPr>
+    </w:p>
+    <w:p>
+      <w:pPr>
+        <w:spacing w:after="0" w:line="240" w:lineRule="auto"/>
+        <w:jc w:val="both"/>
+        <w:rPr>
+          <w:b/>
+          <w:bCs/>
+        </w:rPr>
+      </w:pPr>
+    </w:p>
+    <w:p>
+      <w:pPr>
+        <w:spacing w:after="0" w:line="240" w:lineRule="auto"/>
+        <w:jc w:val="both"/>
+        <w:rPr>
+          <w:b/>
+          <w:bCs/>
+        </w:rPr>
       </w:pPr>
     </w:p>
     <w:p>
@@ -7818,56 +8098,23 @@
         <w:sz w:val="16"/>
         <w:szCs w:val="16"/>
       </w:rPr>
-      <w:t>(27) 3041-7452 / (27) 9 9844-2674</w:t>
+      <w:t>(27) 3041-74</w:t>
     </w:r>
-  </w:p>
-  <w:p>
-    <w:pPr>
-      <w:pBdr>
-        <w:top w:val="nil"/>
-        <w:left w:val="nil"/>
-        <w:bottom w:val="nil"/>
-        <w:right w:val="nil"/>
-        <w:between w:val="nil"/>
-      </w:pBdr>
-      <w:tabs>
-        <w:tab w:val="center" w:pos="4252"/>
-        <w:tab w:val="right" w:pos="8504"/>
-      </w:tabs>
-      <w:spacing w:after="0" w:line="240" w:lineRule="auto"/>
-      <w:jc w:val="center"/>
+    <w:r>
       <w:rPr>
         <w:color w:val="434343"/>
         <w:sz w:val="16"/>
         <w:szCs w:val="16"/>
       </w:rPr>
-    </w:pPr>
+      <w:t>62</w:t>
+    </w:r>
     <w:r>
       <w:rPr>
         <w:color w:val="434343"/>
         <w:sz w:val="16"/>
         <w:szCs w:val="16"/>
       </w:rPr>
-      <w:t xml:space="preserve">e-mail: </w:t>
-    </w:r>
-    <w:hyperlink r:id="rId1">
-      <w:r>
-        <w:rPr>
-          <w:color w:val="434343"/>
-          <w:sz w:val="16"/>
-          <w:szCs w:val="16"/>
-          <w:u w:val="single"/>
-        </w:rPr>
-        <w:t>belmax@belmax.com.br</w:t>
-      </w:r>
-    </w:hyperlink>
-    <w:r>
-      <w:rPr>
-        <w:color w:val="434343"/>
-        <w:sz w:val="16"/>
-        <w:szCs w:val="16"/>
-      </w:rPr>
-      <w:t xml:space="preserve"> - sítio: belmax.com.br</w:t>
+      <w:t xml:space="preserve"> / (27) 9 9844-2674</w:t>
     </w:r>
   </w:p>
 </w:ftr>
@@ -7969,7 +8216,23 @@
         <w:sz w:val="70"/>
         <w:szCs w:val="70"/>
       </w:rPr>
-      <w:t xml:space="preserve">             </w:t>
+      <w:t xml:space="preserve">        </w:t>
+    </w:r>
+    <w:r>
+      <w:rPr>
+        <w:rFonts w:ascii="Balthazar" w:eastAsia="Balthazar" w:hAnsi="Balthazar" w:cs="Balthazar"/>
+        <w:sz w:val="70"/>
+        <w:szCs w:val="70"/>
+      </w:rPr>
+      <w:t xml:space="preserve">                         </w:t>
+    </w:r>
+    <w:r>
+      <w:rPr>
+        <w:rFonts w:ascii="Balthazar" w:eastAsia="Balthazar" w:hAnsi="Balthazar" w:cs="Balthazar"/>
+        <w:sz w:val="70"/>
+        <w:szCs w:val="70"/>
+      </w:rPr>
+      <w:t xml:space="preserve">     </w:t>
     </w:r>
     <w:r>
       <w:rPr>
@@ -7984,9 +8247,9 @@
         <w:noProof/>
       </w:rPr>
       <w:drawing>
-        <wp:inline distT="0" distB="0" distL="0" distR="0" wp14:anchorId="2CCC1640" wp14:editId="2C7E4E1F">
-          <wp:extent cx="2296371" cy="449805"/>
-          <wp:effectExtent l="0" t="0" r="0" b="0"/>
+        <wp:inline distT="0" distB="0" distL="0" distR="0" wp14:anchorId="2CCC1640" wp14:editId="3EE4EF7B">
+          <wp:extent cx="1371600" cy="447675"/>
+          <wp:effectExtent l="0" t="0" r="0" b="9525"/>
           <wp:docPr id="6" name="image2.png" descr="Belmax Comercial"/>
           <wp:cNvGraphicFramePr/>
           <a:graphic xmlns:a="http://schemas.openxmlformats.org/drawingml/2006/main">
@@ -8006,7 +8269,7 @@
                 <pic:spPr>
                   <a:xfrm>
                     <a:off x="0" y="0"/>
-                    <a:ext cx="2296371" cy="449805"/>
+                    <a:ext cx="1398908" cy="456588"/>
                   </a:xfrm>
                   <a:prstGeom prst="rect">
                     <a:avLst/>
@@ -8072,7 +8335,7 @@
             </wp:anchor>
           </w:drawing>
         </mc:Choice>
-        <mc:Fallback xmlns:sl="http://schemas.openxmlformats.org/schemaLibrary/2006/main" xmlns:a="http://schemas.openxmlformats.org/drawingml/2006/main" xmlns:pic="http://schemas.openxmlformats.org/drawingml/2006/picture" xmlns:c="http://schemas.openxmlformats.org/drawingml/2006/chart" xmlns:lc="http://schemas.openxmlformats.org/drawingml/2006/lockedCanvas" xmlns:dgm="http://schemas.openxmlformats.org/drawingml/2006/diagram" xmlns="http://schemas.microsoft.com/office/tasks/2019/documenttasks" xmlns:cr="http://schemas.microsoft.com/office/comments/2020/reactions">
+        <mc:Fallback xmlns:cr="http://schemas.microsoft.com/office/comments/2020/reactions" xmlns="http://schemas.microsoft.com/office/tasks/2019/documenttasks" xmlns:dgm="http://schemas.openxmlformats.org/drawingml/2006/diagram" xmlns:lc="http://schemas.openxmlformats.org/drawingml/2006/lockedCanvas" xmlns:c="http://schemas.openxmlformats.org/drawingml/2006/chart" xmlns:pic="http://schemas.openxmlformats.org/drawingml/2006/picture" xmlns:a="http://schemas.openxmlformats.org/drawingml/2006/main" xmlns:sl="http://schemas.openxmlformats.org/schemaLibrary/2006/main">
           <w:drawing>
             <wp:anchor allowOverlap="1" behindDoc="0" distB="0" distT="0" distL="114300" distR="114300" hidden="0" layoutInCell="1" locked="0" relativeHeight="0" simplePos="0">
               <wp:simplePos x="0" y="0"/>
@@ -8166,7 +8429,7 @@
             </wp:anchor>
           </w:drawing>
         </mc:Choice>
-        <mc:Fallback xmlns:sl="http://schemas.openxmlformats.org/schemaLibrary/2006/main" xmlns:a="http://schemas.openxmlformats.org/drawingml/2006/main" xmlns:pic="http://schemas.openxmlformats.org/drawingml/2006/picture" xmlns:c="http://schemas.openxmlformats.org/drawingml/2006/chart" xmlns:lc="http://schemas.openxmlformats.org/drawingml/2006/lockedCanvas" xmlns:dgm="http://schemas.openxmlformats.org/drawingml/2006/diagram" xmlns="http://schemas.microsoft.com/office/tasks/2019/documenttasks" xmlns:cr="http://schemas.microsoft.com/office/comments/2020/reactions">
+        <mc:Fallback xmlns:cr="http://schemas.microsoft.com/office/comments/2020/reactions" xmlns="http://schemas.microsoft.com/office/tasks/2019/documenttasks" xmlns:dgm="http://schemas.openxmlformats.org/drawingml/2006/diagram" xmlns:lc="http://schemas.openxmlformats.org/drawingml/2006/lockedCanvas" xmlns:c="http://schemas.openxmlformats.org/drawingml/2006/chart" xmlns:pic="http://schemas.openxmlformats.org/drawingml/2006/picture" xmlns:a="http://schemas.openxmlformats.org/drawingml/2006/main" xmlns:sl="http://schemas.openxmlformats.org/schemaLibrary/2006/main">
           <w:drawing>
             <wp:anchor allowOverlap="1" behindDoc="0" distB="0" distT="0" distL="114300" distR="114300" hidden="0" layoutInCell="1" locked="0" relativeHeight="0" simplePos="0">
               <wp:simplePos x="0" y="0"/>
@@ -8260,7 +8523,7 @@
             </wp:anchor>
           </w:drawing>
         </mc:Choice>
-        <mc:Fallback xmlns:sl="http://schemas.openxmlformats.org/schemaLibrary/2006/main" xmlns:a="http://schemas.openxmlformats.org/drawingml/2006/main" xmlns:pic="http://schemas.openxmlformats.org/drawingml/2006/picture" xmlns:c="http://schemas.openxmlformats.org/drawingml/2006/chart" xmlns:lc="http://schemas.openxmlformats.org/drawingml/2006/lockedCanvas" xmlns:dgm="http://schemas.openxmlformats.org/drawingml/2006/diagram" xmlns="http://schemas.microsoft.com/office/tasks/2019/documenttasks" xmlns:cr="http://schemas.microsoft.com/office/comments/2020/reactions">
+        <mc:Fallback xmlns:cr="http://schemas.microsoft.com/office/comments/2020/reactions" xmlns="http://schemas.microsoft.com/office/tasks/2019/documenttasks" xmlns:dgm="http://schemas.openxmlformats.org/drawingml/2006/diagram" xmlns:lc="http://schemas.openxmlformats.org/drawingml/2006/lockedCanvas" xmlns:c="http://schemas.openxmlformats.org/drawingml/2006/chart" xmlns:pic="http://schemas.openxmlformats.org/drawingml/2006/picture" xmlns:a="http://schemas.openxmlformats.org/drawingml/2006/main" xmlns:sl="http://schemas.openxmlformats.org/schemaLibrary/2006/main">
           <w:drawing>
             <wp:anchor allowOverlap="1" behindDoc="0" distB="0" distT="0" distL="114300" distR="114300" hidden="0" layoutInCell="1" locked="0" relativeHeight="0" simplePos="0">
               <wp:simplePos x="0" y="0"/>
@@ -8354,7 +8617,7 @@
             </wp:anchor>
           </w:drawing>
         </mc:Choice>
-        <mc:Fallback xmlns:sl="http://schemas.openxmlformats.org/schemaLibrary/2006/main" xmlns:a="http://schemas.openxmlformats.org/drawingml/2006/main" xmlns:pic="http://schemas.openxmlformats.org/drawingml/2006/picture" xmlns:c="http://schemas.openxmlformats.org/drawingml/2006/chart" xmlns:lc="http://schemas.openxmlformats.org/drawingml/2006/lockedCanvas" xmlns:dgm="http://schemas.openxmlformats.org/drawingml/2006/diagram" xmlns="http://schemas.microsoft.com/office/tasks/2019/documenttasks" xmlns:cr="http://schemas.microsoft.com/office/comments/2020/reactions">
+        <mc:Fallback xmlns:cr="http://schemas.microsoft.com/office/comments/2020/reactions" xmlns="http://schemas.microsoft.com/office/tasks/2019/documenttasks" xmlns:dgm="http://schemas.openxmlformats.org/drawingml/2006/diagram" xmlns:lc="http://schemas.openxmlformats.org/drawingml/2006/lockedCanvas" xmlns:c="http://schemas.openxmlformats.org/drawingml/2006/chart" xmlns:pic="http://schemas.openxmlformats.org/drawingml/2006/picture" xmlns:a="http://schemas.openxmlformats.org/drawingml/2006/main" xmlns:sl="http://schemas.openxmlformats.org/schemaLibrary/2006/main">
           <w:drawing>
             <wp:anchor allowOverlap="1" behindDoc="0" distB="0" distT="0" distL="114300" distR="114300" hidden="0" layoutInCell="1" locked="0" relativeHeight="0" simplePos="0">
               <wp:simplePos x="0" y="0"/>
@@ -10323,6 +10586,50 @@
       </w:tblCellMar>
     </w:tblPr>
   </w:style>
+  <w:style w:type="paragraph" w:styleId="Cabealho">
+    <w:name w:val="header"/>
+    <w:basedOn w:val="Normal"/>
+    <w:link w:val="CabealhoChar"/>
+    <w:uiPriority w:val="99"/>
+    <w:unhideWhenUsed/>
+    <w:rsid w:val="005621CB"/>
+    <w:pPr>
+      <w:tabs>
+        <w:tab w:val="center" w:pos="4252"/>
+        <w:tab w:val="right" w:pos="8504"/>
+      </w:tabs>
+      <w:spacing w:after="0" w:line="240" w:lineRule="auto"/>
+    </w:pPr>
+  </w:style>
+  <w:style w:type="character" w:customStyle="1" w:styleId="CabealhoChar">
+    <w:name w:val="Cabeçalho Char"/>
+    <w:basedOn w:val="Fontepargpadro"/>
+    <w:link w:val="Cabealho"/>
+    <w:uiPriority w:val="99"/>
+    <w:rsid w:val="005621CB"/>
+  </w:style>
+  <w:style w:type="paragraph" w:styleId="Rodap">
+    <w:name w:val="footer"/>
+    <w:basedOn w:val="Normal"/>
+    <w:link w:val="RodapChar"/>
+    <w:uiPriority w:val="99"/>
+    <w:unhideWhenUsed/>
+    <w:rsid w:val="005621CB"/>
+    <w:pPr>
+      <w:tabs>
+        <w:tab w:val="center" w:pos="4252"/>
+        <w:tab w:val="right" w:pos="8504"/>
+      </w:tabs>
+      <w:spacing w:after="0" w:line="240" w:lineRule="auto"/>
+    </w:pPr>
+  </w:style>
+  <w:style w:type="character" w:customStyle="1" w:styleId="RodapChar">
+    <w:name w:val="Rodapé Char"/>
+    <w:basedOn w:val="Fontepargpadro"/>
+    <w:link w:val="Rodap"/>
+    <w:uiPriority w:val="99"/>
+    <w:rsid w:val="005621CB"/>
+  </w:style>
 </w:styles>
 </file>
 

</xml_diff>